<commit_message>
New home layout and cleaning up
</commit_message>
<xml_diff>
--- a/downloads/Tenley_Kennett_Resume_Jan.docx
+++ b/downloads/Tenley_Kennett_Resume_Jan.docx
@@ -41,15 +41,15 @@
           <w:sz w:val="22"/>
           <w:szCs w:val="22"/>
         </w:rPr>
-        <w:t>US Citizen | tenley.kennett</w:t>
-      </w:r>
-      <w:r>
-        <w:rPr>
-          <w:rFonts w:ascii="Calibri" w:hAnsi="Calibri" w:cs="Calibri"/>
-          <w:sz w:val="22"/>
-          <w:szCs w:val="22"/>
-        </w:rPr>
-        <w:t xml:space="preserve">@gmail.com | </w:t>
+        <w:t xml:space="preserve">US Citizen </w:t>
+      </w:r>
+      <w:r>
+        <w:rPr>
+          <w:rFonts w:ascii="Calibri" w:hAnsi="Calibri" w:cs="Calibri"/>
+          <w:sz w:val="22"/>
+          <w:szCs w:val="22"/>
+        </w:rPr>
+        <w:t xml:space="preserve">| </w:t>
       </w:r>
       <w:r>
         <w:rPr>
@@ -65,23 +65,15 @@
           <w:sz w:val="22"/>
           <w:szCs w:val="22"/>
         </w:rPr>
-        <w:t xml:space="preserve"> | 5</w:t>
-      </w:r>
-      <w:r>
-        <w:rPr>
-          <w:rFonts w:ascii="Calibri" w:hAnsi="Calibri" w:cs="Calibri"/>
-          <w:sz w:val="22"/>
-          <w:szCs w:val="22"/>
-        </w:rPr>
-        <w:t>71-598-0875</w:t>
-      </w:r>
-      <w:r>
-        <w:rPr>
-          <w:rFonts w:ascii="Calibri" w:hAnsi="Calibri" w:cs="Calibri"/>
-          <w:sz w:val="22"/>
-          <w:szCs w:val="22"/>
-        </w:rPr>
-        <w:t xml:space="preserve"> | </w:t>
+        <w:t xml:space="preserve"> </w:t>
+      </w:r>
+      <w:r>
+        <w:rPr>
+          <w:rFonts w:ascii="Calibri" w:hAnsi="Calibri" w:cs="Calibri"/>
+          <w:sz w:val="22"/>
+          <w:szCs w:val="22"/>
+        </w:rPr>
+        <w:t xml:space="preserve">| </w:t>
       </w:r>
       <w:r>
         <w:rPr>
@@ -138,14 +130,39 @@
     </w:p>
     <w:p>
       <w:pPr>
+        <w:tabs>
+          <w:tab w:val="left" w:pos="0"/>
+          <w:tab w:val="right" w:pos="9890"/>
+        </w:tabs>
+        <w:spacing w:line="252" w:lineRule="auto"/>
+        <w:rPr>
+          <w:rFonts w:ascii="Calibri" w:hAnsi="Calibri" w:cs="Calibri"/>
+          <w:sz w:val="22"/>
+          <w:szCs w:val="22"/>
+        </w:rPr>
+      </w:pPr>
+      <w:r>
         <w:rPr>
           <w:rFonts w:eastAsia="Times New Roman" w:cstheme="minorHAnsi"/>
+          <w:b/>
           <w:sz w:val="22"/>
           <w:szCs w:val="22"/>
           <w:shd w:val="clear" w:color="auto" w:fill="FFFFFF"/>
           <w:lang w:eastAsia="ko-KR"/>
         </w:rPr>
-      </w:pPr>
+        <w:t>B.S. Computer Science</w:t>
+      </w:r>
+      <w:r>
+        <w:rPr>
+          <w:rFonts w:eastAsia="Times New Roman" w:cstheme="minorHAnsi"/>
+          <w:bCs/>
+          <w:sz w:val="22"/>
+          <w:szCs w:val="22"/>
+          <w:shd w:val="clear" w:color="auto" w:fill="FFFFFF"/>
+          <w:lang w:eastAsia="ko-KR"/>
+        </w:rPr>
+        <w:t>,</w:t>
+      </w:r>
       <w:r>
         <w:rPr>
           <w:rFonts w:eastAsia="Times New Roman" w:cstheme="minorHAnsi"/>
@@ -155,7 +172,7 @@
           <w:shd w:val="clear" w:color="auto" w:fill="FFFFFF"/>
           <w:lang w:eastAsia="ko-KR"/>
         </w:rPr>
-        <w:t>B.S. Computer Science</w:t>
+        <w:t xml:space="preserve"> </w:t>
       </w:r>
       <w:r>
         <w:rPr>
@@ -166,171 +183,23 @@
           <w:shd w:val="clear" w:color="auto" w:fill="FFFFFF"/>
           <w:lang w:eastAsia="ko-KR"/>
         </w:rPr>
-        <w:t>,</w:t>
+        <w:t xml:space="preserve">James Madison University </w:t>
       </w:r>
       <w:r>
         <w:rPr>
           <w:rFonts w:eastAsia="Times New Roman" w:cstheme="minorHAnsi"/>
-          <w:b/>
           <w:sz w:val="22"/>
           <w:szCs w:val="22"/>
           <w:shd w:val="clear" w:color="auto" w:fill="FFFFFF"/>
           <w:lang w:eastAsia="ko-KR"/>
         </w:rPr>
-        <w:t xml:space="preserve"> </w:t>
-      </w:r>
-      <w:r>
-        <w:rPr>
-          <w:rFonts w:eastAsia="Times New Roman" w:cstheme="minorHAnsi"/>
-          <w:bCs/>
-          <w:sz w:val="22"/>
-          <w:szCs w:val="22"/>
-          <w:shd w:val="clear" w:color="auto" w:fill="FFFFFF"/>
-          <w:lang w:eastAsia="ko-KR"/>
-        </w:rPr>
-        <w:t xml:space="preserve">James Madison University </w:t>
-      </w:r>
-      <w:r>
-        <w:rPr>
-          <w:rFonts w:eastAsia="Times New Roman" w:cstheme="minorHAnsi"/>
-          <w:sz w:val="22"/>
-          <w:szCs w:val="22"/>
-          <w:shd w:val="clear" w:color="auto" w:fill="FFFFFF"/>
-          <w:lang w:eastAsia="ko-KR"/>
-        </w:rPr>
         <w:t>| Harrisonburg, VA</w:t>
       </w:r>
       <w:r>
         <w:rPr>
-          <w:rFonts w:eastAsia="Times New Roman" w:cstheme="minorHAnsi"/>
-          <w:sz w:val="22"/>
-          <w:szCs w:val="22"/>
-          <w:shd w:val="clear" w:color="auto" w:fill="FFFFFF"/>
-          <w:lang w:eastAsia="ko-KR"/>
-        </w:rPr>
-        <w:tab/>
-        <w:t xml:space="preserve">     </w:t>
-      </w:r>
-    </w:p>
-    <w:p>
-      <w:pPr>
-        <w:ind w:left="360"/>
-        <w:rPr>
-          <w:rFonts w:eastAsia="Times New Roman" w:cstheme="minorHAnsi"/>
-          <w:sz w:val="22"/>
-          <w:szCs w:val="22"/>
-          <w:shd w:val="clear" w:color="auto" w:fill="FFFFFF"/>
-          <w:lang w:eastAsia="ko-KR"/>
-        </w:rPr>
-      </w:pPr>
-      <w:r>
-        <w:rPr>
-          <w:rFonts w:eastAsia="Times New Roman" w:cstheme="minorHAnsi"/>
-          <w:b/>
-          <w:sz w:val="22"/>
-          <w:szCs w:val="22"/>
-          <w:shd w:val="clear" w:color="auto" w:fill="FFFFFF"/>
-          <w:lang w:eastAsia="ko-KR"/>
-        </w:rPr>
-        <w:t>Geography</w:t>
-      </w:r>
-      <w:r>
-        <w:rPr>
-          <w:rFonts w:eastAsia="Times New Roman" w:cstheme="minorHAnsi"/>
-          <w:b/>
-          <w:sz w:val="22"/>
-          <w:szCs w:val="22"/>
-          <w:shd w:val="clear" w:color="auto" w:fill="FFFFFF"/>
-          <w:lang w:eastAsia="ko-KR"/>
-        </w:rPr>
-        <w:t xml:space="preserve"> </w:t>
-      </w:r>
-      <w:r>
-        <w:rPr>
-          <w:rFonts w:eastAsia="Times New Roman" w:cstheme="minorHAnsi"/>
-          <w:bCs/>
-          <w:sz w:val="22"/>
-          <w:szCs w:val="22"/>
-          <w:shd w:val="clear" w:color="auto" w:fill="FFFFFF"/>
-          <w:lang w:eastAsia="ko-KR"/>
-        </w:rPr>
-        <w:t>and</w:t>
-      </w:r>
-      <w:r>
-        <w:rPr>
-          <w:rFonts w:eastAsia="Times New Roman" w:cstheme="minorHAnsi"/>
-          <w:b/>
-          <w:sz w:val="22"/>
-          <w:szCs w:val="22"/>
-          <w:shd w:val="clear" w:color="auto" w:fill="FFFFFF"/>
-          <w:lang w:eastAsia="ko-KR"/>
-        </w:rPr>
-        <w:t xml:space="preserve"> Spanish </w:t>
-      </w:r>
-      <w:r>
-        <w:rPr>
-          <w:rFonts w:eastAsia="Times New Roman" w:cstheme="minorHAnsi"/>
-          <w:bCs/>
-          <w:sz w:val="22"/>
-          <w:szCs w:val="22"/>
-          <w:shd w:val="clear" w:color="auto" w:fill="FFFFFF"/>
-          <w:lang w:eastAsia="ko-KR"/>
-        </w:rPr>
-        <w:t>minors</w:t>
-      </w:r>
-      <w:r>
-        <w:rPr>
-          <w:rFonts w:eastAsia="Times New Roman" w:cstheme="minorHAnsi"/>
-          <w:bCs/>
-          <w:sz w:val="22"/>
-          <w:szCs w:val="22"/>
-          <w:shd w:val="clear" w:color="auto" w:fill="FFFFFF"/>
-          <w:lang w:eastAsia="ko-KR"/>
-        </w:rPr>
-        <w:tab/>
-      </w:r>
-      <w:r>
-        <w:rPr>
-          <w:rFonts w:eastAsia="Times New Roman" w:cstheme="minorHAnsi"/>
-          <w:bCs/>
-          <w:sz w:val="22"/>
-          <w:szCs w:val="22"/>
-          <w:shd w:val="clear" w:color="auto" w:fill="FFFFFF"/>
-          <w:lang w:eastAsia="ko-KR"/>
-        </w:rPr>
-        <w:tab/>
-      </w:r>
-      <w:r>
-        <w:rPr>
-          <w:rFonts w:eastAsia="Times New Roman" w:cstheme="minorHAnsi"/>
-          <w:bCs/>
-          <w:sz w:val="22"/>
-          <w:szCs w:val="22"/>
-          <w:shd w:val="clear" w:color="auto" w:fill="FFFFFF"/>
-          <w:lang w:eastAsia="ko-KR"/>
-        </w:rPr>
-        <w:tab/>
-      </w:r>
-      <w:r>
-        <w:rPr>
-          <w:rFonts w:eastAsia="Times New Roman" w:cstheme="minorHAnsi"/>
-          <w:bCs/>
-          <w:sz w:val="22"/>
-          <w:szCs w:val="22"/>
-          <w:shd w:val="clear" w:color="auto" w:fill="FFFFFF"/>
-          <w:lang w:eastAsia="ko-KR"/>
-        </w:rPr>
-        <w:tab/>
-        <w:t xml:space="preserve">  </w:t>
-      </w:r>
-      <w:r>
-        <w:rPr>
-          <w:rFonts w:eastAsia="Times New Roman" w:cstheme="minorHAnsi"/>
-          <w:bCs/>
-          <w:sz w:val="22"/>
-          <w:szCs w:val="22"/>
-          <w:shd w:val="clear" w:color="auto" w:fill="FFFFFF"/>
-          <w:lang w:eastAsia="ko-KR"/>
+          <w:rFonts w:ascii="Calibri" w:hAnsi="Calibri" w:cs="Calibri"/>
+          <w:sz w:val="22"/>
+          <w:szCs w:val="22"/>
         </w:rPr>
         <w:tab/>
       </w:r>
@@ -381,6 +250,86 @@
           <w:lang w:eastAsia="ko-KR"/>
         </w:rPr>
         <w:t>May 2027</w:t>
+      </w:r>
+    </w:p>
+    <w:p>
+      <w:pPr>
+        <w:ind w:left="360"/>
+        <w:rPr>
+          <w:rFonts w:eastAsia="Times New Roman" w:cstheme="minorHAnsi"/>
+          <w:b/>
+          <w:bCs/>
+          <w:sz w:val="22"/>
+          <w:szCs w:val="22"/>
+          <w:shd w:val="clear" w:color="auto" w:fill="FFFFFF"/>
+          <w:lang w:eastAsia="ko-KR"/>
+        </w:rPr>
+      </w:pPr>
+      <w:r>
+        <w:rPr>
+          <w:rFonts w:eastAsia="Times New Roman" w:cstheme="minorHAnsi"/>
+          <w:bCs/>
+          <w:sz w:val="22"/>
+          <w:szCs w:val="22"/>
+          <w:shd w:val="clear" w:color="auto" w:fill="FFFFFF"/>
+          <w:lang w:eastAsia="ko-KR"/>
+        </w:rPr>
+        <w:t xml:space="preserve">Minors in </w:t>
+      </w:r>
+      <w:r>
+        <w:rPr>
+          <w:rFonts w:eastAsia="Times New Roman" w:cstheme="minorHAnsi"/>
+          <w:b/>
+          <w:sz w:val="22"/>
+          <w:szCs w:val="22"/>
+          <w:shd w:val="clear" w:color="auto" w:fill="FFFFFF"/>
+          <w:lang w:eastAsia="ko-KR"/>
+        </w:rPr>
+        <w:t>Geograph</w:t>
+      </w:r>
+      <w:r>
+        <w:rPr>
+          <w:rFonts w:eastAsia="Times New Roman" w:cstheme="minorHAnsi"/>
+          <w:b/>
+          <w:sz w:val="22"/>
+          <w:szCs w:val="22"/>
+          <w:shd w:val="clear" w:color="auto" w:fill="FFFFFF"/>
+          <w:lang w:eastAsia="ko-KR"/>
+        </w:rPr>
+        <w:t>ic Information Systems</w:t>
+      </w:r>
+      <w:r>
+        <w:rPr>
+          <w:rFonts w:eastAsia="Times New Roman" w:cstheme="minorHAnsi"/>
+          <w:b/>
+          <w:sz w:val="22"/>
+          <w:szCs w:val="22"/>
+          <w:shd w:val="clear" w:color="auto" w:fill="FFFFFF"/>
+          <w:lang w:eastAsia="ko-KR"/>
+        </w:rPr>
+        <w:t xml:space="preserve"> </w:t>
+      </w:r>
+      <w:r>
+        <w:rPr>
+          <w:rFonts w:eastAsia="Times New Roman" w:cstheme="minorHAnsi"/>
+          <w:bCs/>
+          <w:sz w:val="22"/>
+          <w:szCs w:val="22"/>
+          <w:shd w:val="clear" w:color="auto" w:fill="FFFFFF"/>
+          <w:lang w:eastAsia="ko-KR"/>
+        </w:rPr>
+        <w:t>and</w:t>
+      </w:r>
+      <w:r>
+        <w:rPr>
+          <w:rFonts w:eastAsia="Times New Roman" w:cstheme="minorHAnsi"/>
+          <w:b/>
+          <w:sz w:val="22"/>
+          <w:szCs w:val="22"/>
+          <w:shd w:val="clear" w:color="auto" w:fill="FFFFFF"/>
+          <w:lang w:eastAsia="ko-KR"/>
+        </w:rPr>
+        <w:t xml:space="preserve"> Spanish</w:t>
       </w:r>
     </w:p>
     <w:p>
@@ -630,6 +579,17 @@
           <w:szCs w:val="22"/>
           <w:u w:val="single"/>
         </w:rPr>
+        <w:t xml:space="preserve">RELEVANT </w:t>
+      </w:r>
+      <w:r>
+        <w:rPr>
+          <w:rFonts w:ascii="Calibri" w:hAnsi="Calibri" w:cs="Calibri"/>
+          <w:b/>
+          <w:bCs/>
+          <w:sz w:val="22"/>
+          <w:szCs w:val="22"/>
+          <w:u w:val="single"/>
+        </w:rPr>
         <w:t xml:space="preserve">PROJECTS                                                                                  </w:t>
       </w:r>
       <w:r>
@@ -1149,9 +1109,21 @@
         </w:rPr>
         <w:t xml:space="preserve">WORK EXPERIENCE                                                                          </w:t>
       </w:r>
+      <w:r>
+        <w:rPr>
+          <w:rFonts w:ascii="Calibri" w:hAnsi="Calibri" w:cs="Calibri"/>
+          <w:sz w:val="22"/>
+          <w:szCs w:val="22"/>
+        </w:rPr>
+        <w:t xml:space="preserve"> </w:t>
+      </w:r>
     </w:p>
     <w:p>
       <w:pPr>
+        <w:tabs>
+          <w:tab w:val="left" w:pos="0"/>
+          <w:tab w:val="right" w:pos="9890"/>
+        </w:tabs>
         <w:spacing w:line="252" w:lineRule="auto"/>
         <w:rPr>
           <w:rFonts w:ascii="Calibri" w:hAnsi="Calibri" w:cs="Calibri"/>
@@ -1191,56 +1163,32 @@
           <w:sz w:val="22"/>
           <w:szCs w:val="22"/>
         </w:rPr>
-        <w:t xml:space="preserve">      </w:t>
-      </w:r>
-      <w:r>
-        <w:rPr>
-          <w:rFonts w:ascii="Calibri" w:hAnsi="Calibri" w:cs="Calibri"/>
-          <w:sz w:val="22"/>
-          <w:szCs w:val="22"/>
-        </w:rPr>
         <w:tab/>
-      </w:r>
-      <w:r>
-        <w:rPr>
-          <w:rFonts w:ascii="Calibri" w:hAnsi="Calibri" w:cs="Calibri"/>
-          <w:sz w:val="22"/>
-          <w:szCs w:val="22"/>
-        </w:rPr>
-        <w:tab/>
-      </w:r>
-      <w:r>
-        <w:rPr>
-          <w:rFonts w:ascii="Calibri" w:hAnsi="Calibri" w:cs="Calibri"/>
-          <w:sz w:val="22"/>
-          <w:szCs w:val="22"/>
-        </w:rPr>
-        <w:tab/>
-        <w:t xml:space="preserve">  </w:t>
-      </w:r>
-      <w:r>
-        <w:rPr>
-          <w:rFonts w:ascii="Calibri" w:hAnsi="Calibri" w:cs="Calibri"/>
-          <w:sz w:val="22"/>
-          <w:szCs w:val="22"/>
-        </w:rPr>
-        <w:t xml:space="preserve">02/2024 – </w:t>
-      </w:r>
-      <w:r>
-        <w:rPr>
-          <w:rFonts w:ascii="Calibri" w:hAnsi="Calibri" w:cs="Calibri"/>
-          <w:sz w:val="22"/>
-          <w:szCs w:val="22"/>
-        </w:rPr>
-        <w:t>present</w:t>
-      </w:r>
-      <w:r>
-        <w:rPr>
-          <w:rFonts w:ascii="Calibri" w:hAnsi="Calibri" w:cs="Calibri"/>
-          <w:sz w:val="22"/>
-          <w:szCs w:val="22"/>
-        </w:rPr>
-        <w:t xml:space="preserve"> </w:t>
+        <w:t xml:space="preserve">Feb </w:t>
+      </w:r>
+      <w:r>
+        <w:rPr>
+          <w:rFonts w:ascii="Calibri" w:hAnsi="Calibri" w:cs="Calibri"/>
+          <w:sz w:val="22"/>
+          <w:szCs w:val="22"/>
+        </w:rPr>
+        <w:t xml:space="preserve">2024 – </w:t>
+      </w:r>
+      <w:r>
+        <w:rPr>
+          <w:rFonts w:ascii="Calibri" w:hAnsi="Calibri" w:cs="Calibri"/>
+          <w:sz w:val="22"/>
+          <w:szCs w:val="22"/>
+        </w:rPr>
+        <w:t>presen</w:t>
+      </w:r>
+      <w:r>
+        <w:rPr>
+          <w:rFonts w:ascii="Calibri" w:hAnsi="Calibri" w:cs="Calibri"/>
+          <w:sz w:val="22"/>
+          <w:szCs w:val="22"/>
+        </w:rPr>
+        <w:t>t</w:t>
       </w:r>
     </w:p>
     <w:p>
@@ -1339,6 +1287,10 @@
     </w:p>
     <w:p>
       <w:pPr>
+        <w:tabs>
+          <w:tab w:val="left" w:pos="0"/>
+          <w:tab w:val="right" w:pos="9890"/>
+        </w:tabs>
         <w:spacing w:line="252" w:lineRule="auto"/>
         <w:rPr>
           <w:rFonts w:ascii="Calibri" w:hAnsi="Calibri" w:cs="Calibri"/>
@@ -1409,28 +1361,66 @@
       <w:r>
         <w:rPr>
           <w:rFonts w:ascii="Calibri" w:hAnsi="Calibri" w:cs="Calibri"/>
-          <w:b/>
-          <w:bCs/>
-          <w:sz w:val="22"/>
-          <w:szCs w:val="22"/>
-        </w:rPr>
-        <w:t xml:space="preserve">                  </w:t>
-      </w:r>
-      <w:r>
-        <w:rPr>
-          <w:rFonts w:ascii="Calibri" w:hAnsi="Calibri" w:cs="Calibri"/>
-          <w:sz w:val="22"/>
-          <w:szCs w:val="22"/>
-        </w:rPr>
-        <w:t xml:space="preserve">01/2025 – </w:t>
-      </w:r>
-      <w:r>
-        <w:rPr>
-          <w:rFonts w:ascii="Calibri" w:hAnsi="Calibri" w:cs="Calibri"/>
-          <w:sz w:val="22"/>
-          <w:szCs w:val="22"/>
-        </w:rPr>
-        <w:t>present</w:t>
+          <w:sz w:val="22"/>
+          <w:szCs w:val="22"/>
+        </w:rPr>
+        <w:tab/>
+      </w:r>
+      <w:r>
+        <w:rPr>
+          <w:rFonts w:ascii="Calibri" w:hAnsi="Calibri" w:cs="Calibri"/>
+          <w:sz w:val="22"/>
+          <w:szCs w:val="22"/>
+        </w:rPr>
+        <w:t>Jan</w:t>
+      </w:r>
+      <w:r>
+        <w:rPr>
+          <w:rFonts w:ascii="Calibri" w:hAnsi="Calibri" w:cs="Calibri"/>
+          <w:sz w:val="22"/>
+          <w:szCs w:val="22"/>
+        </w:rPr>
+        <w:t xml:space="preserve"> </w:t>
+      </w:r>
+      <w:r>
+        <w:rPr>
+          <w:rFonts w:ascii="Calibri" w:hAnsi="Calibri" w:cs="Calibri"/>
+          <w:sz w:val="22"/>
+          <w:szCs w:val="22"/>
+        </w:rPr>
+        <w:t>202</w:t>
+      </w:r>
+      <w:r>
+        <w:rPr>
+          <w:rFonts w:ascii="Calibri" w:hAnsi="Calibri" w:cs="Calibri"/>
+          <w:sz w:val="22"/>
+          <w:szCs w:val="22"/>
+        </w:rPr>
+        <w:t>5</w:t>
+      </w:r>
+      <w:r>
+        <w:rPr>
+          <w:rFonts w:ascii="Calibri" w:hAnsi="Calibri" w:cs="Calibri"/>
+          <w:sz w:val="22"/>
+          <w:szCs w:val="22"/>
+        </w:rPr>
+        <w:t xml:space="preserve"> – </w:t>
+      </w:r>
+      <w:r>
+        <w:rPr>
+          <w:rFonts w:ascii="Calibri" w:hAnsi="Calibri" w:cs="Calibri"/>
+          <w:sz w:val="22"/>
+          <w:szCs w:val="22"/>
+        </w:rPr>
+        <w:t>presen</w:t>
+      </w:r>
+      <w:r>
+        <w:rPr>
+          <w:rFonts w:ascii="Calibri" w:hAnsi="Calibri" w:cs="Calibri"/>
+          <w:sz w:val="22"/>
+          <w:szCs w:val="22"/>
+        </w:rPr>
+        <w:t>t</w:t>
       </w:r>
     </w:p>
     <w:p>
@@ -1626,7 +1616,15 @@
           <w:sz w:val="22"/>
           <w:szCs w:val="22"/>
         </w:rPr>
-        <w:t xml:space="preserve">08/2025 – </w:t>
+        <w:t xml:space="preserve">Aug </w:t>
+      </w:r>
+      <w:r>
+        <w:rPr>
+          <w:rFonts w:ascii="Calibri" w:hAnsi="Calibri" w:cs="Calibri"/>
+          <w:sz w:val="22"/>
+          <w:szCs w:val="22"/>
+        </w:rPr>
+        <w:t xml:space="preserve">2025 – </w:t>
       </w:r>
       <w:r>
         <w:rPr>
@@ -1781,15 +1779,22 @@
           <w:szCs w:val="22"/>
         </w:rPr>
         <w:tab/>
-        <w:t>11</w:t>
-      </w:r>
-      <w:r>
-        <w:rPr>
-          <w:rFonts w:ascii="Calibri" w:hAnsi="Calibri" w:cs="Calibri"/>
-          <w:sz w:val="22"/>
-          <w:szCs w:val="22"/>
-        </w:rPr>
-        <w:t xml:space="preserve">/2025 – </w:t>
+      </w:r>
+      <w:r>
+        <w:rPr>
+          <w:rFonts w:ascii="Calibri" w:hAnsi="Calibri" w:cs="Calibri"/>
+          <w:sz w:val="22"/>
+          <w:szCs w:val="22"/>
+        </w:rPr>
+        <w:t xml:space="preserve">Nov </w:t>
+      </w:r>
+      <w:r>
+        <w:rPr>
+          <w:rFonts w:ascii="Calibri" w:hAnsi="Calibri" w:cs="Calibri"/>
+          <w:sz w:val="22"/>
+          <w:szCs w:val="22"/>
+        </w:rPr>
+        <w:t xml:space="preserve">2025 – </w:t>
       </w:r>
       <w:r>
         <w:rPr>
@@ -1862,148 +1867,6 @@
         </w:tabs>
         <w:spacing w:line="252" w:lineRule="auto"/>
         <w:rPr>
-          <w:rFonts w:ascii="Calibri" w:hAnsi="Calibri" w:cs="Calibri"/>
-          <w:sz w:val="22"/>
-          <w:szCs w:val="22"/>
-        </w:rPr>
-      </w:pPr>
-      <w:r>
-        <w:rPr>
-          <w:rFonts w:ascii="Calibri" w:hAnsi="Calibri" w:cs="Calibri"/>
-          <w:b/>
-          <w:bCs/>
-          <w:sz w:val="22"/>
-          <w:szCs w:val="22"/>
-        </w:rPr>
-        <w:t>Cohort Leader</w:t>
-      </w:r>
-      <w:r>
-        <w:rPr>
-          <w:rFonts w:ascii="Calibri" w:hAnsi="Calibri" w:cs="Calibri"/>
-          <w:sz w:val="22"/>
-          <w:szCs w:val="22"/>
-        </w:rPr>
-        <w:t xml:space="preserve">, JMU </w:t>
-      </w:r>
-      <w:proofErr w:type="spellStart"/>
-      <w:r>
-        <w:rPr>
-          <w:rFonts w:ascii="Calibri" w:hAnsi="Calibri" w:cs="Calibri"/>
-          <w:sz w:val="22"/>
-          <w:szCs w:val="22"/>
-        </w:rPr>
-        <w:t>madiSTEM</w:t>
-      </w:r>
-      <w:proofErr w:type="spellEnd"/>
-      <w:r>
-        <w:rPr>
-          <w:rFonts w:ascii="Calibri" w:hAnsi="Calibri" w:cs="Calibri"/>
-          <w:sz w:val="22"/>
-          <w:szCs w:val="22"/>
-        </w:rPr>
-        <w:tab/>
-      </w:r>
-      <w:r>
-        <w:rPr>
-          <w:rFonts w:ascii="Calibri" w:hAnsi="Calibri" w:cs="Calibri"/>
-          <w:sz w:val="22"/>
-          <w:szCs w:val="22"/>
-        </w:rPr>
-        <w:t>03/2024, 03/2025</w:t>
-      </w:r>
-    </w:p>
-    <w:p>
-      <w:pPr>
-        <w:pStyle w:val="ListParagraph"/>
-        <w:numPr>
-          <w:ilvl w:val="0"/>
-          <w:numId w:val="4"/>
-        </w:numPr>
-        <w:rPr>
-          <w:rFonts w:ascii="Calibri" w:eastAsia="Times New Roman" w:hAnsi="Calibri" w:cs="Calibri"/>
-          <w:sz w:val="22"/>
-          <w:szCs w:val="22"/>
-          <w:lang w:eastAsia="en-US"/>
-        </w:rPr>
-      </w:pPr>
-      <w:r>
-        <w:rPr>
-          <w:rFonts w:ascii="Calibri" w:eastAsia="Times New Roman" w:hAnsi="Calibri" w:cs="Calibri"/>
-          <w:sz w:val="22"/>
-          <w:szCs w:val="22"/>
-          <w:lang w:eastAsia="en-US"/>
-        </w:rPr>
-        <w:t xml:space="preserve">Led a cohort of middle school girls at </w:t>
-      </w:r>
-      <w:r>
-        <w:rPr>
-          <w:rFonts w:ascii="Calibri" w:eastAsia="Times New Roman" w:hAnsi="Calibri" w:cs="Calibri"/>
-          <w:sz w:val="22"/>
-          <w:szCs w:val="22"/>
-          <w:lang w:eastAsia="en-US"/>
-        </w:rPr>
-        <w:t xml:space="preserve">a JMU </w:t>
-      </w:r>
-      <w:r>
-        <w:rPr>
-          <w:rFonts w:ascii="Calibri" w:eastAsia="Times New Roman" w:hAnsi="Calibri" w:cs="Calibri"/>
-          <w:sz w:val="22"/>
-          <w:szCs w:val="22"/>
-          <w:lang w:eastAsia="en-US"/>
-        </w:rPr>
-        <w:t>conference, facilitat</w:t>
-      </w:r>
-      <w:r>
-        <w:rPr>
-          <w:rFonts w:ascii="Calibri" w:eastAsia="Times New Roman" w:hAnsi="Calibri" w:cs="Calibri"/>
-          <w:sz w:val="22"/>
-          <w:szCs w:val="22"/>
-          <w:lang w:eastAsia="en-US"/>
-        </w:rPr>
-        <w:t>ing</w:t>
-      </w:r>
-      <w:r>
-        <w:rPr>
-          <w:rFonts w:ascii="Calibri" w:eastAsia="Times New Roman" w:hAnsi="Calibri" w:cs="Calibri"/>
-          <w:sz w:val="22"/>
-          <w:szCs w:val="22"/>
-          <w:lang w:eastAsia="en-US"/>
-        </w:rPr>
-        <w:t xml:space="preserve"> hands-on STEM workshops</w:t>
-      </w:r>
-    </w:p>
-    <w:p>
-      <w:pPr>
-        <w:pStyle w:val="ListParagraph"/>
-        <w:numPr>
-          <w:ilvl w:val="0"/>
-          <w:numId w:val="4"/>
-        </w:numPr>
-        <w:rPr>
-          <w:rFonts w:ascii="Calibri" w:eastAsia="Times New Roman" w:hAnsi="Calibri" w:cs="Calibri"/>
-          <w:sz w:val="22"/>
-          <w:szCs w:val="22"/>
-          <w:lang w:eastAsia="en-US"/>
-        </w:rPr>
-      </w:pPr>
-      <w:r>
-        <w:rPr>
-          <w:rFonts w:ascii="Calibri" w:eastAsia="Times New Roman" w:hAnsi="Calibri" w:cs="Calibri"/>
-          <w:sz w:val="22"/>
-          <w:szCs w:val="22"/>
-          <w:lang w:eastAsia="en-US"/>
-        </w:rPr>
-        <w:t>Provided mentorship and guidance to students, fostering a supportive learning environment</w:t>
-      </w:r>
-    </w:p>
-    <w:p>
-      <w:pPr>
-        <w:tabs>
-          <w:tab w:val="left" w:pos="0"/>
-          <w:tab w:val="right" w:pos="9890"/>
-        </w:tabs>
-        <w:spacing w:line="252" w:lineRule="auto"/>
-        <w:rPr>
           <w:rFonts w:ascii="Calibri" w:eastAsia="Times New Roman" w:hAnsi="Calibri" w:cs="Calibri"/>
           <w:sz w:val="22"/>
           <w:szCs w:val="22"/>
@@ -2063,7 +1926,16 @@
           <w:szCs w:val="22"/>
           <w:lang w:eastAsia="en-US"/>
         </w:rPr>
-        <w:t>09/202</w:t>
+        <w:t xml:space="preserve">Sep </w:t>
+      </w:r>
+      <w:r>
+        <w:rPr>
+          <w:rFonts w:ascii="Calibri" w:eastAsia="Times New Roman" w:hAnsi="Calibri" w:cs="Calibri"/>
+          <w:sz w:val="22"/>
+          <w:szCs w:val="22"/>
+          <w:lang w:eastAsia="en-US"/>
+        </w:rPr>
+        <w:t>202</w:t>
       </w:r>
       <w:r>
         <w:rPr>
@@ -2153,6 +2025,172 @@
         </w:tabs>
         <w:spacing w:line="252" w:lineRule="auto"/>
         <w:rPr>
+          <w:rFonts w:ascii="Calibri" w:hAnsi="Calibri" w:cs="Calibri"/>
+          <w:sz w:val="22"/>
+          <w:szCs w:val="22"/>
+        </w:rPr>
+      </w:pPr>
+      <w:r>
+        <w:rPr>
+          <w:rFonts w:ascii="Calibri" w:hAnsi="Calibri" w:cs="Calibri"/>
+          <w:b/>
+          <w:bCs/>
+          <w:sz w:val="22"/>
+          <w:szCs w:val="22"/>
+        </w:rPr>
+        <w:t>Cohort Leader</w:t>
+      </w:r>
+      <w:r>
+        <w:rPr>
+          <w:rFonts w:ascii="Calibri" w:hAnsi="Calibri" w:cs="Calibri"/>
+          <w:sz w:val="22"/>
+          <w:szCs w:val="22"/>
+        </w:rPr>
+        <w:t xml:space="preserve">, JMU </w:t>
+      </w:r>
+      <w:proofErr w:type="spellStart"/>
+      <w:r>
+        <w:rPr>
+          <w:rFonts w:ascii="Calibri" w:hAnsi="Calibri" w:cs="Calibri"/>
+          <w:sz w:val="22"/>
+          <w:szCs w:val="22"/>
+        </w:rPr>
+        <w:t>madiSTEM</w:t>
+      </w:r>
+      <w:proofErr w:type="spellEnd"/>
+      <w:r>
+        <w:rPr>
+          <w:rFonts w:ascii="Calibri" w:hAnsi="Calibri" w:cs="Calibri"/>
+          <w:sz w:val="22"/>
+          <w:szCs w:val="22"/>
+        </w:rPr>
+        <w:tab/>
+      </w:r>
+      <w:r>
+        <w:rPr>
+          <w:rFonts w:ascii="Calibri" w:hAnsi="Calibri" w:cs="Calibri"/>
+          <w:sz w:val="22"/>
+          <w:szCs w:val="22"/>
+        </w:rPr>
+        <w:t xml:space="preserve">Mar </w:t>
+      </w:r>
+      <w:r>
+        <w:rPr>
+          <w:rFonts w:ascii="Calibri" w:hAnsi="Calibri" w:cs="Calibri"/>
+          <w:sz w:val="22"/>
+          <w:szCs w:val="22"/>
+        </w:rPr>
+        <w:t xml:space="preserve">2024, </w:t>
+      </w:r>
+      <w:r>
+        <w:rPr>
+          <w:rFonts w:ascii="Calibri" w:hAnsi="Calibri" w:cs="Calibri"/>
+          <w:sz w:val="22"/>
+          <w:szCs w:val="22"/>
+        </w:rPr>
+        <w:t xml:space="preserve">Mar </w:t>
+      </w:r>
+      <w:r>
+        <w:rPr>
+          <w:rFonts w:ascii="Calibri" w:hAnsi="Calibri" w:cs="Calibri"/>
+          <w:sz w:val="22"/>
+          <w:szCs w:val="22"/>
+        </w:rPr>
+        <w:t>2025</w:t>
+      </w:r>
+    </w:p>
+    <w:p>
+      <w:pPr>
+        <w:pStyle w:val="ListParagraph"/>
+        <w:numPr>
+          <w:ilvl w:val="0"/>
+          <w:numId w:val="4"/>
+        </w:numPr>
+        <w:rPr>
+          <w:rFonts w:ascii="Calibri" w:eastAsia="Times New Roman" w:hAnsi="Calibri" w:cs="Calibri"/>
+          <w:sz w:val="22"/>
+          <w:szCs w:val="22"/>
+          <w:lang w:eastAsia="en-US"/>
+        </w:rPr>
+      </w:pPr>
+      <w:r>
+        <w:rPr>
+          <w:rFonts w:ascii="Calibri" w:eastAsia="Times New Roman" w:hAnsi="Calibri" w:cs="Calibri"/>
+          <w:sz w:val="22"/>
+          <w:szCs w:val="22"/>
+          <w:lang w:eastAsia="en-US"/>
+        </w:rPr>
+        <w:t xml:space="preserve">Led a cohort of middle school girls at </w:t>
+      </w:r>
+      <w:r>
+        <w:rPr>
+          <w:rFonts w:ascii="Calibri" w:eastAsia="Times New Roman" w:hAnsi="Calibri" w:cs="Calibri"/>
+          <w:sz w:val="22"/>
+          <w:szCs w:val="22"/>
+          <w:lang w:eastAsia="en-US"/>
+        </w:rPr>
+        <w:t xml:space="preserve">a JMU </w:t>
+      </w:r>
+      <w:r>
+        <w:rPr>
+          <w:rFonts w:ascii="Calibri" w:eastAsia="Times New Roman" w:hAnsi="Calibri" w:cs="Calibri"/>
+          <w:sz w:val="22"/>
+          <w:szCs w:val="22"/>
+          <w:lang w:eastAsia="en-US"/>
+        </w:rPr>
+        <w:t>conference, facilitat</w:t>
+      </w:r>
+      <w:r>
+        <w:rPr>
+          <w:rFonts w:ascii="Calibri" w:eastAsia="Times New Roman" w:hAnsi="Calibri" w:cs="Calibri"/>
+          <w:sz w:val="22"/>
+          <w:szCs w:val="22"/>
+          <w:lang w:eastAsia="en-US"/>
+        </w:rPr>
+        <w:t>ing</w:t>
+      </w:r>
+      <w:r>
+        <w:rPr>
+          <w:rFonts w:ascii="Calibri" w:eastAsia="Times New Roman" w:hAnsi="Calibri" w:cs="Calibri"/>
+          <w:sz w:val="22"/>
+          <w:szCs w:val="22"/>
+          <w:lang w:eastAsia="en-US"/>
+        </w:rPr>
+        <w:t xml:space="preserve"> hands-on STEM workshops</w:t>
+      </w:r>
+    </w:p>
+    <w:p>
+      <w:pPr>
+        <w:pStyle w:val="ListParagraph"/>
+        <w:numPr>
+          <w:ilvl w:val="0"/>
+          <w:numId w:val="4"/>
+        </w:numPr>
+        <w:rPr>
+          <w:rFonts w:ascii="Calibri" w:eastAsia="Times New Roman" w:hAnsi="Calibri" w:cs="Calibri"/>
+          <w:sz w:val="22"/>
+          <w:szCs w:val="22"/>
+          <w:lang w:eastAsia="en-US"/>
+        </w:rPr>
+      </w:pPr>
+      <w:r>
+        <w:rPr>
+          <w:rFonts w:ascii="Calibri" w:eastAsia="Times New Roman" w:hAnsi="Calibri" w:cs="Calibri"/>
+          <w:sz w:val="22"/>
+          <w:szCs w:val="22"/>
+          <w:lang w:eastAsia="en-US"/>
+        </w:rPr>
+        <w:t>Provided mentorship and guidance to students, fostering a supportive learning environment</w:t>
+      </w:r>
+    </w:p>
+    <w:p>
+      <w:pPr>
+        <w:tabs>
+          <w:tab w:val="left" w:pos="0"/>
+          <w:tab w:val="right" w:pos="9890"/>
+        </w:tabs>
+        <w:spacing w:line="252" w:lineRule="auto"/>
+        <w:rPr>
           <w:rFonts w:ascii="Calibri" w:eastAsia="Times New Roman" w:hAnsi="Calibri" w:cs="Calibri"/>
           <w:sz w:val="22"/>
           <w:szCs w:val="22"/>
@@ -2214,7 +2252,16 @@
           <w:szCs w:val="22"/>
           <w:lang w:eastAsia="en-US"/>
         </w:rPr>
-        <w:t>11/2023</w:t>
+        <w:t xml:space="preserve">Nov </w:t>
+      </w:r>
+      <w:r>
+        <w:rPr>
+          <w:rFonts w:ascii="Calibri" w:eastAsia="Times New Roman" w:hAnsi="Calibri" w:cs="Calibri"/>
+          <w:sz w:val="22"/>
+          <w:szCs w:val="22"/>
+          <w:lang w:eastAsia="en-US"/>
+        </w:rPr>
+        <w:t>2023</w:t>
       </w:r>
     </w:p>
     <w:p>

</xml_diff>

<commit_message>
Feedback changes implemented: fixed navbar, updated footer, etc.
</commit_message>
<xml_diff>
--- a/downloads/Tenley_Kennett_Resume_Jan.docx
+++ b/downloads/Tenley_Kennett_Resume_Jan.docx
@@ -1139,6 +1139,179 @@
           <w:sz w:val="22"/>
           <w:szCs w:val="22"/>
         </w:rPr>
+        <w:t>Computer Science Ambassador</w:t>
+      </w:r>
+      <w:r>
+        <w:rPr>
+          <w:rFonts w:ascii="Calibri" w:hAnsi="Calibri" w:cs="Calibri"/>
+          <w:b/>
+          <w:bCs/>
+          <w:sz w:val="22"/>
+          <w:szCs w:val="22"/>
+        </w:rPr>
+        <w:t xml:space="preserve">, </w:t>
+      </w:r>
+      <w:r>
+        <w:rPr>
+          <w:rFonts w:ascii="Calibri" w:hAnsi="Calibri" w:cs="Calibri"/>
+          <w:sz w:val="22"/>
+          <w:szCs w:val="22"/>
+        </w:rPr>
+        <w:t>JMU</w:t>
+      </w:r>
+      <w:r>
+        <w:rPr>
+          <w:rFonts w:ascii="Calibri" w:hAnsi="Calibri" w:cs="Calibri"/>
+          <w:sz w:val="22"/>
+          <w:szCs w:val="22"/>
+        </w:rPr>
+        <w:tab/>
+        <w:t xml:space="preserve">Aug </w:t>
+      </w:r>
+      <w:r>
+        <w:rPr>
+          <w:rFonts w:ascii="Calibri" w:hAnsi="Calibri" w:cs="Calibri"/>
+          <w:sz w:val="22"/>
+          <w:szCs w:val="22"/>
+        </w:rPr>
+        <w:t xml:space="preserve">2025 – </w:t>
+      </w:r>
+      <w:r>
+        <w:rPr>
+          <w:rFonts w:ascii="Calibri" w:hAnsi="Calibri" w:cs="Calibri"/>
+          <w:sz w:val="22"/>
+          <w:szCs w:val="22"/>
+        </w:rPr>
+        <w:t>present</w:t>
+      </w:r>
+    </w:p>
+    <w:p>
+      <w:pPr>
+        <w:pStyle w:val="ListParagraph"/>
+        <w:numPr>
+          <w:ilvl w:val="0"/>
+          <w:numId w:val="30"/>
+        </w:numPr>
+        <w:rPr>
+          <w:rFonts w:ascii="Calibri" w:hAnsi="Calibri" w:cs="Calibri"/>
+          <w:sz w:val="22"/>
+          <w:szCs w:val="22"/>
+        </w:rPr>
+      </w:pPr>
+      <w:r>
+        <w:rPr>
+          <w:rFonts w:ascii="Calibri" w:hAnsi="Calibri" w:cs="Calibri"/>
+          <w:sz w:val="22"/>
+          <w:szCs w:val="22"/>
+        </w:rPr>
+        <w:t>Communicate technical concepts and program information to</w:t>
+      </w:r>
+      <w:r>
+        <w:rPr>
+          <w:rFonts w:ascii="Calibri" w:hAnsi="Calibri" w:cs="Calibri"/>
+          <w:sz w:val="22"/>
+          <w:szCs w:val="22"/>
+        </w:rPr>
+        <w:t xml:space="preserve"> </w:t>
+      </w:r>
+      <w:r>
+        <w:rPr>
+          <w:rFonts w:ascii="Calibri" w:hAnsi="Calibri" w:cs="Calibri"/>
+          <w:sz w:val="22"/>
+          <w:szCs w:val="22"/>
+        </w:rPr>
+        <w:t xml:space="preserve">prospective students and families </w:t>
+      </w:r>
+    </w:p>
+    <w:p>
+      <w:pPr>
+        <w:pStyle w:val="ListParagraph"/>
+        <w:numPr>
+          <w:ilvl w:val="0"/>
+          <w:numId w:val="30"/>
+        </w:numPr>
+        <w:rPr>
+          <w:rFonts w:ascii="Calibri" w:hAnsi="Calibri" w:cs="Calibri"/>
+          <w:sz w:val="22"/>
+          <w:szCs w:val="22"/>
+        </w:rPr>
+      </w:pPr>
+      <w:r>
+        <w:rPr>
+          <w:rFonts w:ascii="Calibri" w:hAnsi="Calibri" w:cs="Calibri"/>
+          <w:sz w:val="22"/>
+          <w:szCs w:val="22"/>
+        </w:rPr>
+        <w:t xml:space="preserve">Collaborate with the CS Ambassador team </w:t>
+      </w:r>
+      <w:r>
+        <w:rPr>
+          <w:rFonts w:ascii="Calibri" w:hAnsi="Calibri" w:cs="Calibri"/>
+          <w:sz w:val="22"/>
+          <w:szCs w:val="22"/>
+        </w:rPr>
+        <w:t>to plan and execute outreach events and digital campaigns</w:t>
+      </w:r>
+    </w:p>
+    <w:p>
+      <w:pPr>
+        <w:pStyle w:val="ListParagraph"/>
+        <w:numPr>
+          <w:ilvl w:val="0"/>
+          <w:numId w:val="30"/>
+        </w:numPr>
+        <w:rPr>
+          <w:rFonts w:ascii="Calibri" w:hAnsi="Calibri" w:cs="Calibri"/>
+          <w:sz w:val="22"/>
+          <w:szCs w:val="22"/>
+        </w:rPr>
+      </w:pPr>
+      <w:r>
+        <w:rPr>
+          <w:rFonts w:ascii="Calibri" w:hAnsi="Calibri" w:cs="Calibri"/>
+          <w:sz w:val="22"/>
+          <w:szCs w:val="22"/>
+        </w:rPr>
+        <w:t>Represent</w:t>
+      </w:r>
+      <w:r>
+        <w:rPr>
+          <w:rFonts w:ascii="Calibri" w:hAnsi="Calibri" w:cs="Calibri"/>
+          <w:sz w:val="22"/>
+          <w:szCs w:val="22"/>
+        </w:rPr>
+        <w:t xml:space="preserve"> the </w:t>
+      </w:r>
+      <w:r>
+        <w:rPr>
+          <w:rFonts w:ascii="Calibri" w:hAnsi="Calibri" w:cs="Calibri"/>
+          <w:sz w:val="22"/>
+          <w:szCs w:val="22"/>
+        </w:rPr>
+        <w:t>CS program during tours, info sessions, and prospective student days</w:t>
+      </w:r>
+    </w:p>
+    <w:p>
+      <w:pPr>
+        <w:tabs>
+          <w:tab w:val="left" w:pos="0"/>
+          <w:tab w:val="right" w:pos="9890"/>
+        </w:tabs>
+        <w:spacing w:line="252" w:lineRule="auto"/>
+        <w:rPr>
+          <w:rFonts w:ascii="Calibri" w:hAnsi="Calibri" w:cs="Calibri"/>
+          <w:sz w:val="22"/>
+          <w:szCs w:val="22"/>
+        </w:rPr>
+      </w:pPr>
+      <w:r>
+        <w:rPr>
+          <w:rFonts w:ascii="Calibri" w:hAnsi="Calibri" w:cs="Calibri"/>
+          <w:b/>
+          <w:bCs/>
+          <w:sz w:val="22"/>
+          <w:szCs w:val="22"/>
+        </w:rPr>
         <w:t>Study Abroad Operations Intern</w:t>
       </w:r>
       <w:r>
@@ -1365,22 +1538,7 @@
           <w:szCs w:val="22"/>
         </w:rPr>
         <w:tab/>
-      </w:r>
-      <w:r>
-        <w:rPr>
-          <w:rFonts w:ascii="Calibri" w:hAnsi="Calibri" w:cs="Calibri"/>
-          <w:sz w:val="22"/>
-          <w:szCs w:val="22"/>
-        </w:rPr>
-        <w:t>Jan</w:t>
-      </w:r>
-      <w:r>
-        <w:rPr>
-          <w:rFonts w:ascii="Calibri" w:hAnsi="Calibri" w:cs="Calibri"/>
-          <w:sz w:val="22"/>
-          <w:szCs w:val="22"/>
-        </w:rPr>
-        <w:t xml:space="preserve"> </w:t>
+        <w:t xml:space="preserve">Jan </w:t>
       </w:r>
       <w:r>
         <w:rPr>
@@ -1559,186 +1717,6 @@
           <w:szCs w:val="22"/>
         </w:rPr>
         <w:t xml:space="preserve">                 </w:t>
-      </w:r>
-    </w:p>
-    <w:p>
-      <w:pPr>
-        <w:tabs>
-          <w:tab w:val="left" w:pos="0"/>
-          <w:tab w:val="right" w:pos="9890"/>
-        </w:tabs>
-        <w:spacing w:line="252" w:lineRule="auto"/>
-        <w:rPr>
-          <w:rFonts w:ascii="Calibri" w:hAnsi="Calibri" w:cs="Calibri"/>
-          <w:sz w:val="22"/>
-          <w:szCs w:val="22"/>
-        </w:rPr>
-      </w:pPr>
-      <w:r>
-        <w:rPr>
-          <w:rFonts w:ascii="Calibri" w:hAnsi="Calibri" w:cs="Calibri"/>
-          <w:b/>
-          <w:bCs/>
-          <w:sz w:val="22"/>
-          <w:szCs w:val="22"/>
-        </w:rPr>
-        <w:t>Computer Science Ambassador</w:t>
-      </w:r>
-      <w:r>
-        <w:rPr>
-          <w:rFonts w:ascii="Calibri" w:hAnsi="Calibri" w:cs="Calibri"/>
-          <w:b/>
-          <w:bCs/>
-          <w:sz w:val="22"/>
-          <w:szCs w:val="22"/>
-        </w:rPr>
-        <w:t xml:space="preserve">, </w:t>
-      </w:r>
-      <w:r>
-        <w:rPr>
-          <w:rFonts w:ascii="Calibri" w:hAnsi="Calibri" w:cs="Calibri"/>
-          <w:sz w:val="22"/>
-          <w:szCs w:val="22"/>
-        </w:rPr>
-        <w:t>JMU</w:t>
-      </w:r>
-      <w:r>
-        <w:rPr>
-          <w:rFonts w:ascii="Calibri" w:hAnsi="Calibri" w:cs="Calibri"/>
-          <w:sz w:val="22"/>
-          <w:szCs w:val="22"/>
-        </w:rPr>
-        <w:tab/>
-      </w:r>
-      <w:r>
-        <w:rPr>
-          <w:rFonts w:ascii="Calibri" w:hAnsi="Calibri" w:cs="Calibri"/>
-          <w:sz w:val="22"/>
-          <w:szCs w:val="22"/>
-        </w:rPr>
-        <w:t xml:space="preserve">Aug </w:t>
-      </w:r>
-      <w:r>
-        <w:rPr>
-          <w:rFonts w:ascii="Calibri" w:hAnsi="Calibri" w:cs="Calibri"/>
-          <w:sz w:val="22"/>
-          <w:szCs w:val="22"/>
-        </w:rPr>
-        <w:t xml:space="preserve">2025 – </w:t>
-      </w:r>
-      <w:r>
-        <w:rPr>
-          <w:rFonts w:ascii="Calibri" w:hAnsi="Calibri" w:cs="Calibri"/>
-          <w:sz w:val="22"/>
-          <w:szCs w:val="22"/>
-        </w:rPr>
-        <w:t>present</w:t>
-      </w:r>
-    </w:p>
-    <w:p>
-      <w:pPr>
-        <w:pStyle w:val="ListParagraph"/>
-        <w:numPr>
-          <w:ilvl w:val="0"/>
-          <w:numId w:val="30"/>
-        </w:numPr>
-        <w:rPr>
-          <w:rFonts w:ascii="Calibri" w:hAnsi="Calibri" w:cs="Calibri"/>
-          <w:sz w:val="22"/>
-          <w:szCs w:val="22"/>
-        </w:rPr>
-      </w:pPr>
-      <w:r>
-        <w:rPr>
-          <w:rFonts w:ascii="Calibri" w:hAnsi="Calibri" w:cs="Calibri"/>
-          <w:sz w:val="22"/>
-          <w:szCs w:val="22"/>
-        </w:rPr>
-        <w:t>Communicate technical concepts and program information to</w:t>
-      </w:r>
-      <w:r>
-        <w:rPr>
-          <w:rFonts w:ascii="Calibri" w:hAnsi="Calibri" w:cs="Calibri"/>
-          <w:sz w:val="22"/>
-          <w:szCs w:val="22"/>
-        </w:rPr>
-        <w:t xml:space="preserve"> </w:t>
-      </w:r>
-      <w:r>
-        <w:rPr>
-          <w:rFonts w:ascii="Calibri" w:hAnsi="Calibri" w:cs="Calibri"/>
-          <w:sz w:val="22"/>
-          <w:szCs w:val="22"/>
-        </w:rPr>
-        <w:t xml:space="preserve">prospective students and families </w:t>
-      </w:r>
-    </w:p>
-    <w:p>
-      <w:pPr>
-        <w:pStyle w:val="ListParagraph"/>
-        <w:numPr>
-          <w:ilvl w:val="0"/>
-          <w:numId w:val="30"/>
-        </w:numPr>
-        <w:rPr>
-          <w:rFonts w:ascii="Calibri" w:hAnsi="Calibri" w:cs="Calibri"/>
-          <w:sz w:val="22"/>
-          <w:szCs w:val="22"/>
-        </w:rPr>
-      </w:pPr>
-      <w:r>
-        <w:rPr>
-          <w:rFonts w:ascii="Calibri" w:hAnsi="Calibri" w:cs="Calibri"/>
-          <w:sz w:val="22"/>
-          <w:szCs w:val="22"/>
-        </w:rPr>
-        <w:t xml:space="preserve">Collaborate with the CS Ambassador team </w:t>
-      </w:r>
-      <w:r>
-        <w:rPr>
-          <w:rFonts w:ascii="Calibri" w:hAnsi="Calibri" w:cs="Calibri"/>
-          <w:sz w:val="22"/>
-          <w:szCs w:val="22"/>
-        </w:rPr>
-        <w:t>to plan and execute outreach events and digital campaigns</w:t>
-      </w:r>
-    </w:p>
-    <w:p>
-      <w:pPr>
-        <w:pStyle w:val="ListParagraph"/>
-        <w:numPr>
-          <w:ilvl w:val="0"/>
-          <w:numId w:val="30"/>
-        </w:numPr>
-        <w:rPr>
-          <w:rFonts w:ascii="Calibri" w:hAnsi="Calibri" w:cs="Calibri"/>
-          <w:sz w:val="22"/>
-          <w:szCs w:val="22"/>
-        </w:rPr>
-      </w:pPr>
-      <w:r>
-        <w:rPr>
-          <w:rFonts w:ascii="Calibri" w:hAnsi="Calibri" w:cs="Calibri"/>
-          <w:sz w:val="22"/>
-          <w:szCs w:val="22"/>
-        </w:rPr>
-        <w:t>Represent</w:t>
-      </w:r>
-      <w:r>
-        <w:rPr>
-          <w:rFonts w:ascii="Calibri" w:hAnsi="Calibri" w:cs="Calibri"/>
-          <w:sz w:val="22"/>
-          <w:szCs w:val="22"/>
-        </w:rPr>
-        <w:t xml:space="preserve"> the </w:t>
-      </w:r>
-      <w:r>
-        <w:rPr>
-          <w:rFonts w:ascii="Calibri" w:hAnsi="Calibri" w:cs="Calibri"/>
-          <w:sz w:val="22"/>
-          <w:szCs w:val="22"/>
-        </w:rPr>
-        <w:t>CS program during tours, info sessions, and prospective student days</w:t>
       </w:r>
     </w:p>
     <w:p>

</xml_diff>